<commit_message>
docs: update technical report with phase grouping, references, and section fixes
</commit_message>
<xml_diff>
--- a/docs/Kewei_Portfolio_Technical_Report.docx
+++ b/docs/Kewei_Portfolio_Technical_Report.docx
@@ -536,15 +536,16 @@
         <w:tblLook w:firstColumn="1" w:firstRow="1" w:lastColumn="0" w:lastRow="0" w:noHBand="0" w:noVBand="1" w:val="04A0"/>
       </w:tblPr>
       <w:tblGrid>
-        <w:gridCol w:w="2340"/>
-        <w:gridCol w:w="2340"/>
-        <w:gridCol w:w="2340"/>
-        <w:gridCol w:w="2340"/>
+        <w:gridCol w:w="1872"/>
+        <w:gridCol w:w="1872"/>
+        <w:gridCol w:w="1872"/>
+        <w:gridCol w:w="1872"/>
+        <w:gridCol w:w="1872"/>
       </w:tblGrid>
       <w:tr>
         <w:tc>
           <w:tcPr>
-            <w:tcW w:type="dxa" w:w="850"/>
+            <w:tcW w:type="dxa" w:w="567"/>
             <w:shd w:fill="4F46E5" w:val="clear"/>
           </w:tcPr>
           <w:p>
@@ -563,7 +564,7 @@
         </w:tc>
         <w:tc>
           <w:tcPr>
-            <w:tcW w:type="dxa" w:w="2268"/>
+            <w:tcW w:type="dxa" w:w="1984"/>
             <w:shd w:fill="4F46E5" w:val="clear"/>
           </w:tcPr>
           <w:p>
@@ -582,7 +583,7 @@
         </w:tc>
         <w:tc>
           <w:tcPr>
-            <w:tcW w:type="dxa" w:w="2268"/>
+            <w:tcW w:type="dxa" w:w="1984"/>
             <w:shd w:fill="4F46E5" w:val="clear"/>
           </w:tcPr>
           <w:p>
@@ -596,6 +597,25 @@
                 <w:sz w:val="20"/>
               </w:rPr>
               <w:t>Page/Route</w:t>
+            </w:r>
+          </w:p>
+        </w:tc>
+        <w:tc>
+          <w:tcPr>
+            <w:tcW w:type="dxa" w:w="850"/>
+            <w:shd w:fill="4F46E5" w:val="clear"/>
+          </w:tcPr>
+          <w:p>
+            <w:pPr>
+              <w:jc w:val="center"/>
+            </w:pPr>
+            <w:r>
+              <w:rPr>
+                <w:b/>
+                <w:color w:val="FFFFFF"/>
+                <w:sz w:val="20"/>
+              </w:rPr>
+              <w:t>Phase</w:t>
             </w:r>
           </w:p>
         </w:tc>
@@ -622,7 +642,7 @@
       <w:tr>
         <w:tc>
           <w:tcPr>
-            <w:tcW w:type="dxa" w:w="850"/>
+            <w:tcW w:type="dxa" w:w="567"/>
           </w:tcPr>
           <w:p>
             <w:r>
@@ -635,7 +655,7 @@
         </w:tc>
         <w:tc>
           <w:tcPr>
-            <w:tcW w:type="dxa" w:w="2268"/>
+            <w:tcW w:type="dxa" w:w="1984"/>
           </w:tcPr>
           <w:p>
             <w:r>
@@ -648,7 +668,7 @@
         </w:tc>
         <w:tc>
           <w:tcPr>
-            <w:tcW w:type="dxa" w:w="2268"/>
+            <w:tcW w:type="dxa" w:w="1984"/>
           </w:tcPr>
           <w:p>
             <w:r>
@@ -656,6 +676,19 @@
                 <w:sz w:val="20"/>
               </w:rPr>
               <w:t>/</w:t>
+            </w:r>
+          </w:p>
+        </w:tc>
+        <w:tc>
+          <w:tcPr>
+            <w:tcW w:type="dxa" w:w="850"/>
+          </w:tcPr>
+          <w:p>
+            <w:r>
+              <w:rPr>
+                <w:sz w:val="20"/>
+              </w:rPr>
+              <w:t>1</w:t>
             </w:r>
           </w:p>
         </w:tc>
@@ -676,7 +709,7 @@
       <w:tr>
         <w:tc>
           <w:tcPr>
-            <w:tcW w:type="dxa" w:w="850"/>
+            <w:tcW w:type="dxa" w:w="567"/>
             <w:shd w:fill="F3F4F6" w:val="clear"/>
           </w:tcPr>
           <w:p>
@@ -690,7 +723,7 @@
         </w:tc>
         <w:tc>
           <w:tcPr>
-            <w:tcW w:type="dxa" w:w="2268"/>
+            <w:tcW w:type="dxa" w:w="1984"/>
             <w:shd w:fill="F3F4F6" w:val="clear"/>
           </w:tcPr>
           <w:p>
@@ -704,7 +737,7 @@
         </w:tc>
         <w:tc>
           <w:tcPr>
-            <w:tcW w:type="dxa" w:w="2268"/>
+            <w:tcW w:type="dxa" w:w="1984"/>
             <w:shd w:fill="F3F4F6" w:val="clear"/>
           </w:tcPr>
           <w:p>
@@ -718,6 +751,20 @@
         </w:tc>
         <w:tc>
           <w:tcPr>
+            <w:tcW w:type="dxa" w:w="850"/>
+            <w:shd w:fill="F3F4F6" w:val="clear"/>
+          </w:tcPr>
+          <w:p>
+            <w:r>
+              <w:rPr>
+                <w:sz w:val="20"/>
+              </w:rPr>
+              <w:t>1</w:t>
+            </w:r>
+          </w:p>
+        </w:tc>
+        <w:tc>
+          <w:tcPr>
             <w:tcW w:type="dxa" w:w="3969"/>
             <w:shd w:fill="F3F4F6" w:val="clear"/>
           </w:tcPr>
@@ -726,7 +773,7 @@
               <w:rPr>
                 <w:sz w:val="20"/>
               </w:rPr>
-              <w:t>Personal intro and work experience</w:t>
+              <w:t>Personal background and interests</w:t>
             </w:r>
           </w:p>
         </w:tc>
@@ -734,7 +781,7 @@
       <w:tr>
         <w:tc>
           <w:tcPr>
-            <w:tcW w:type="dxa" w:w="850"/>
+            <w:tcW w:type="dxa" w:w="567"/>
           </w:tcPr>
           <w:p>
             <w:r>
@@ -747,7 +794,7 @@
         </w:tc>
         <w:tc>
           <w:tcPr>
-            <w:tcW w:type="dxa" w:w="2268"/>
+            <w:tcW w:type="dxa" w:w="1984"/>
           </w:tcPr>
           <w:p>
             <w:r>
@@ -760,7 +807,7 @@
         </w:tc>
         <w:tc>
           <w:tcPr>
-            <w:tcW w:type="dxa" w:w="2268"/>
+            <w:tcW w:type="dxa" w:w="1984"/>
           </w:tcPr>
           <w:p>
             <w:r>
@@ -773,6 +820,19 @@
         </w:tc>
         <w:tc>
           <w:tcPr>
+            <w:tcW w:type="dxa" w:w="850"/>
+          </w:tcPr>
+          <w:p>
+            <w:r>
+              <w:rPr>
+                <w:sz w:val="20"/>
+              </w:rPr>
+              <w:t>1</w:t>
+            </w:r>
+          </w:p>
+        </w:tc>
+        <w:tc>
+          <w:tcPr>
             <w:tcW w:type="dxa" w:w="3969"/>
           </w:tcPr>
           <w:p>
@@ -780,7 +840,7 @@
               <w:rPr>
                 <w:sz w:val="20"/>
               </w:rPr>
-              <w:t>Timeline of education and work history</w:t>
+              <w:t>Education and work timeline</w:t>
             </w:r>
           </w:p>
         </w:tc>
@@ -788,7 +848,7 @@
       <w:tr>
         <w:tc>
           <w:tcPr>
-            <w:tcW w:type="dxa" w:w="850"/>
+            <w:tcW w:type="dxa" w:w="567"/>
             <w:shd w:fill="F3F4F6" w:val="clear"/>
           </w:tcPr>
           <w:p>
@@ -802,7 +862,7 @@
         </w:tc>
         <w:tc>
           <w:tcPr>
-            <w:tcW w:type="dxa" w:w="2268"/>
+            <w:tcW w:type="dxa" w:w="1984"/>
             <w:shd w:fill="F3F4F6" w:val="clear"/>
           </w:tcPr>
           <w:p>
@@ -816,7 +876,7 @@
         </w:tc>
         <w:tc>
           <w:tcPr>
-            <w:tcW w:type="dxa" w:w="2268"/>
+            <w:tcW w:type="dxa" w:w="1984"/>
             <w:shd w:fill="F3F4F6" w:val="clear"/>
           </w:tcPr>
           <w:p>
@@ -830,6 +890,20 @@
         </w:tc>
         <w:tc>
           <w:tcPr>
+            <w:tcW w:type="dxa" w:w="850"/>
+            <w:shd w:fill="F3F4F6" w:val="clear"/>
+          </w:tcPr>
+          <w:p>
+            <w:r>
+              <w:rPr>
+                <w:sz w:val="20"/>
+              </w:rPr>
+              <w:t>1</w:t>
+            </w:r>
+          </w:p>
+        </w:tc>
+        <w:tc>
+          <w:tcPr>
             <w:tcW w:type="dxa" w:w="3969"/>
             <w:shd w:fill="F3F4F6" w:val="clear"/>
           </w:tcPr>
@@ -838,7 +912,7 @@
               <w:rPr>
                 <w:sz w:val="20"/>
               </w:rPr>
-              <w:t>Skill tags grouped by category</w:t>
+              <w:t>Skills grouped by category</w:t>
             </w:r>
           </w:p>
         </w:tc>
@@ -846,7 +920,7 @@
       <w:tr>
         <w:tc>
           <w:tcPr>
-            <w:tcW w:type="dxa" w:w="850"/>
+            <w:tcW w:type="dxa" w:w="567"/>
           </w:tcPr>
           <w:p>
             <w:r>
@@ -859,7 +933,7 @@
         </w:tc>
         <w:tc>
           <w:tcPr>
-            <w:tcW w:type="dxa" w:w="2268"/>
+            <w:tcW w:type="dxa" w:w="1984"/>
           </w:tcPr>
           <w:p>
             <w:r>
@@ -872,7 +946,7 @@
         </w:tc>
         <w:tc>
           <w:tcPr>
-            <w:tcW w:type="dxa" w:w="2268"/>
+            <w:tcW w:type="dxa" w:w="1984"/>
           </w:tcPr>
           <w:p>
             <w:r>
@@ -885,6 +959,19 @@
         </w:tc>
         <w:tc>
           <w:tcPr>
+            <w:tcW w:type="dxa" w:w="850"/>
+          </w:tcPr>
+          <w:p>
+            <w:r>
+              <w:rPr>
+                <w:sz w:val="20"/>
+              </w:rPr>
+              <w:t>1</w:t>
+            </w:r>
+          </w:p>
+        </w:tc>
+        <w:tc>
+          <w:tcPr>
             <w:tcW w:type="dxa" w:w="3969"/>
           </w:tcPr>
           <w:p>
@@ -892,7 +979,7 @@
               <w:rPr>
                 <w:sz w:val="20"/>
               </w:rPr>
-              <w:t>Photo grid for projects and events</w:t>
+              <w:t>Photo grid of projects and events</w:t>
             </w:r>
           </w:p>
         </w:tc>
@@ -900,7 +987,7 @@
       <w:tr>
         <w:tc>
           <w:tcPr>
-            <w:tcW w:type="dxa" w:w="850"/>
+            <w:tcW w:type="dxa" w:w="567"/>
             <w:shd w:fill="F3F4F6" w:val="clear"/>
           </w:tcPr>
           <w:p>
@@ -914,7 +1001,7 @@
         </w:tc>
         <w:tc>
           <w:tcPr>
-            <w:tcW w:type="dxa" w:w="2268"/>
+            <w:tcW w:type="dxa" w:w="1984"/>
             <w:shd w:fill="F3F4F6" w:val="clear"/>
           </w:tcPr>
           <w:p>
@@ -928,7 +1015,7 @@
         </w:tc>
         <w:tc>
           <w:tcPr>
-            <w:tcW w:type="dxa" w:w="2268"/>
+            <w:tcW w:type="dxa" w:w="1984"/>
             <w:shd w:fill="F3F4F6" w:val="clear"/>
           </w:tcPr>
           <w:p>
@@ -937,6 +1024,20 @@
                 <w:sz w:val="20"/>
               </w:rPr>
               <w:t>/videos</w:t>
+            </w:r>
+          </w:p>
+        </w:tc>
+        <w:tc>
+          <w:tcPr>
+            <w:tcW w:type="dxa" w:w="850"/>
+            <w:shd w:fill="F3F4F6" w:val="clear"/>
+          </w:tcPr>
+          <w:p>
+            <w:r>
+              <w:rPr>
+                <w:sz w:val="20"/>
+              </w:rPr>
+              <w:t>1</w:t>
             </w:r>
           </w:p>
         </w:tc>
@@ -958,7 +1059,7 @@
       <w:tr>
         <w:tc>
           <w:tcPr>
-            <w:tcW w:type="dxa" w:w="850"/>
+            <w:tcW w:type="dxa" w:w="567"/>
           </w:tcPr>
           <w:p>
             <w:r>
@@ -971,27 +1072,40 @@
         </w:tc>
         <w:tc>
           <w:tcPr>
-            <w:tcW w:type="dxa" w:w="2268"/>
+            <w:tcW w:type="dxa" w:w="1984"/>
           </w:tcPr>
           <w:p>
             <w:r>
               <w:rPr>
                 <w:sz w:val="20"/>
               </w:rPr>
-              <w:t>Blog</w:t>
+              <w:t>Navigation Bar</w:t>
             </w:r>
           </w:p>
         </w:tc>
         <w:tc>
           <w:tcPr>
-            <w:tcW w:type="dxa" w:w="2268"/>
+            <w:tcW w:type="dxa" w:w="1984"/>
           </w:tcPr>
           <w:p>
             <w:r>
               <w:rPr>
                 <w:sz w:val="20"/>
               </w:rPr>
-              <w:t>/blog, /blog/:id</w:t>
+              <w:t>—</w:t>
+            </w:r>
+          </w:p>
+        </w:tc>
+        <w:tc>
+          <w:tcPr>
+            <w:tcW w:type="dxa" w:w="850"/>
+          </w:tcPr>
+          <w:p>
+            <w:r>
+              <w:rPr>
+                <w:sz w:val="20"/>
+              </w:rPr>
+              <w:t>1</w:t>
             </w:r>
           </w:p>
         </w:tc>
@@ -1004,7 +1118,7 @@
               <w:rPr>
                 <w:sz w:val="20"/>
               </w:rPr>
-              <w:t>Article list with Markdown detail pages</w:t>
+              <w:t>Top navigation with active styling</w:t>
             </w:r>
           </w:p>
         </w:tc>
@@ -1012,7 +1126,7 @@
       <w:tr>
         <w:tc>
           <w:tcPr>
-            <w:tcW w:type="dxa" w:w="850"/>
+            <w:tcW w:type="dxa" w:w="567"/>
             <w:shd w:fill="F3F4F6" w:val="clear"/>
           </w:tcPr>
           <w:p>
@@ -1026,8 +1140,217 @@
         </w:tc>
         <w:tc>
           <w:tcPr>
-            <w:tcW w:type="dxa" w:w="2268"/>
+            <w:tcW w:type="dxa" w:w="1984"/>
             <w:shd w:fill="F3F4F6" w:val="clear"/>
+          </w:tcPr>
+          <w:p>
+            <w:r>
+              <w:rPr>
+                <w:sz w:val="20"/>
+              </w:rPr>
+              <w:t>Client-side Routing</w:t>
+            </w:r>
+          </w:p>
+        </w:tc>
+        <w:tc>
+          <w:tcPr>
+            <w:tcW w:type="dxa" w:w="1984"/>
+            <w:shd w:fill="F3F4F6" w:val="clear"/>
+          </w:tcPr>
+          <w:p>
+            <w:r>
+              <w:rPr>
+                <w:sz w:val="20"/>
+              </w:rPr>
+              <w:t>—</w:t>
+            </w:r>
+          </w:p>
+        </w:tc>
+        <w:tc>
+          <w:tcPr>
+            <w:tcW w:type="dxa" w:w="850"/>
+            <w:shd w:fill="F3F4F6" w:val="clear"/>
+          </w:tcPr>
+          <w:p>
+            <w:r>
+              <w:rPr>
+                <w:sz w:val="20"/>
+              </w:rPr>
+              <w:t>1</w:t>
+            </w:r>
+          </w:p>
+        </w:tc>
+        <w:tc>
+          <w:tcPr>
+            <w:tcW w:type="dxa" w:w="3969"/>
+            <w:shd w:fill="F3F4F6" w:val="clear"/>
+          </w:tcPr>
+          <w:p>
+            <w:r>
+              <w:rPr>
+                <w:sz w:val="20"/>
+              </w:rPr>
+              <w:t>React Router page navigation</w:t>
+            </w:r>
+          </w:p>
+        </w:tc>
+      </w:tr>
+      <w:tr>
+        <w:tc>
+          <w:tcPr>
+            <w:tcW w:type="dxa" w:w="567"/>
+          </w:tcPr>
+          <w:p>
+            <w:r>
+              <w:rPr>
+                <w:sz w:val="20"/>
+              </w:rPr>
+              <w:t>9</w:t>
+            </w:r>
+          </w:p>
+        </w:tc>
+        <w:tc>
+          <w:tcPr>
+            <w:tcW w:type="dxa" w:w="1984"/>
+          </w:tcPr>
+          <w:p>
+            <w:r>
+              <w:rPr>
+                <w:sz w:val="20"/>
+              </w:rPr>
+              <w:t>CSS Styling</w:t>
+            </w:r>
+          </w:p>
+        </w:tc>
+        <w:tc>
+          <w:tcPr>
+            <w:tcW w:type="dxa" w:w="1984"/>
+          </w:tcPr>
+          <w:p>
+            <w:r>
+              <w:rPr>
+                <w:sz w:val="20"/>
+              </w:rPr>
+              <w:t>—</w:t>
+            </w:r>
+          </w:p>
+        </w:tc>
+        <w:tc>
+          <w:tcPr>
+            <w:tcW w:type="dxa" w:w="850"/>
+          </w:tcPr>
+          <w:p>
+            <w:r>
+              <w:rPr>
+                <w:sz w:val="20"/>
+              </w:rPr>
+              <w:t>1</w:t>
+            </w:r>
+          </w:p>
+        </w:tc>
+        <w:tc>
+          <w:tcPr>
+            <w:tcW w:type="dxa" w:w="3969"/>
+          </w:tcPr>
+          <w:p>
+            <w:r>
+              <w:rPr>
+                <w:sz w:val="20"/>
+              </w:rPr>
+              <w:t>CSS Modules and theme variables</w:t>
+            </w:r>
+          </w:p>
+        </w:tc>
+      </w:tr>
+      <w:tr>
+        <w:tc>
+          <w:tcPr>
+            <w:tcW w:type="dxa" w:w="567"/>
+            <w:shd w:fill="F3F4F6" w:val="clear"/>
+          </w:tcPr>
+          <w:p>
+            <w:r>
+              <w:rPr>
+                <w:sz w:val="20"/>
+              </w:rPr>
+              <w:t>10</w:t>
+            </w:r>
+          </w:p>
+        </w:tc>
+        <w:tc>
+          <w:tcPr>
+            <w:tcW w:type="dxa" w:w="1984"/>
+            <w:shd w:fill="F3F4F6" w:val="clear"/>
+          </w:tcPr>
+          <w:p>
+            <w:r>
+              <w:rPr>
+                <w:sz w:val="20"/>
+              </w:rPr>
+              <w:t>Blog</w:t>
+            </w:r>
+          </w:p>
+        </w:tc>
+        <w:tc>
+          <w:tcPr>
+            <w:tcW w:type="dxa" w:w="1984"/>
+            <w:shd w:fill="F3F4F6" w:val="clear"/>
+          </w:tcPr>
+          <w:p>
+            <w:r>
+              <w:rPr>
+                <w:sz w:val="20"/>
+              </w:rPr>
+              <w:t>/blog, /blog/:id</w:t>
+            </w:r>
+          </w:p>
+        </w:tc>
+        <w:tc>
+          <w:tcPr>
+            <w:tcW w:type="dxa" w:w="850"/>
+            <w:shd w:fill="F3F4F6" w:val="clear"/>
+          </w:tcPr>
+          <w:p>
+            <w:r>
+              <w:rPr>
+                <w:sz w:val="20"/>
+              </w:rPr>
+              <w:t>2</w:t>
+            </w:r>
+          </w:p>
+        </w:tc>
+        <w:tc>
+          <w:tcPr>
+            <w:tcW w:type="dxa" w:w="3969"/>
+            <w:shd w:fill="F3F4F6" w:val="clear"/>
+          </w:tcPr>
+          <w:p>
+            <w:r>
+              <w:rPr>
+                <w:sz w:val="20"/>
+              </w:rPr>
+              <w:t>Articles with Markdown detail</w:t>
+            </w:r>
+          </w:p>
+        </w:tc>
+      </w:tr>
+      <w:tr>
+        <w:tc>
+          <w:tcPr>
+            <w:tcW w:type="dxa" w:w="567"/>
+          </w:tcPr>
+          <w:p>
+            <w:r>
+              <w:rPr>
+                <w:sz w:val="20"/>
+              </w:rPr>
+              <w:t>11</w:t>
+            </w:r>
+          </w:p>
+        </w:tc>
+        <w:tc>
+          <w:tcPr>
+            <w:tcW w:type="dxa" w:w="1984"/>
           </w:tcPr>
           <w:p>
             <w:r>
@@ -1040,8 +1363,7 @@
         </w:tc>
         <w:tc>
           <w:tcPr>
-            <w:tcW w:type="dxa" w:w="2268"/>
-            <w:shd w:fill="F3F4F6" w:val="clear"/>
+            <w:tcW w:type="dxa" w:w="1984"/>
           </w:tcPr>
           <w:p>
             <w:r>
@@ -1054,8 +1376,20 @@
         </w:tc>
         <w:tc>
           <w:tcPr>
+            <w:tcW w:type="dxa" w:w="850"/>
+          </w:tcPr>
+          <w:p>
+            <w:r>
+              <w:rPr>
+                <w:sz w:val="20"/>
+              </w:rPr>
+              <w:t>2</w:t>
+            </w:r>
+          </w:p>
+        </w:tc>
+        <w:tc>
+          <w:tcPr>
             <w:tcW w:type="dxa" w:w="3969"/>
-            <w:shd w:fill="F3F4F6" w:val="clear"/>
           </w:tcPr>
           <w:p>
             <w:r>
@@ -1070,20 +1404,22 @@
       <w:tr>
         <w:tc>
           <w:tcPr>
-            <w:tcW w:type="dxa" w:w="850"/>
+            <w:tcW w:type="dxa" w:w="567"/>
+            <w:shd w:fill="F3F4F6" w:val="clear"/>
           </w:tcPr>
           <w:p>
             <w:r>
               <w:rPr>
                 <w:sz w:val="20"/>
               </w:rPr>
-              <w:t>9</w:t>
+              <w:t>12</w:t>
             </w:r>
           </w:p>
         </w:tc>
         <w:tc>
           <w:tcPr>
-            <w:tcW w:type="dxa" w:w="2268"/>
+            <w:tcW w:type="dxa" w:w="1984"/>
+            <w:shd w:fill="F3F4F6" w:val="clear"/>
           </w:tcPr>
           <w:p>
             <w:r>
@@ -1096,7 +1432,8 @@
         </w:tc>
         <w:tc>
           <w:tcPr>
-            <w:tcW w:type="dxa" w:w="2268"/>
+            <w:tcW w:type="dxa" w:w="1984"/>
+            <w:shd w:fill="F3F4F6" w:val="clear"/>
           </w:tcPr>
           <w:p>
             <w:r>
@@ -1109,6 +1446,88 @@
         </w:tc>
         <w:tc>
           <w:tcPr>
+            <w:tcW w:type="dxa" w:w="850"/>
+            <w:shd w:fill="F3F4F6" w:val="clear"/>
+          </w:tcPr>
+          <w:p>
+            <w:r>
+              <w:rPr>
+                <w:sz w:val="20"/>
+              </w:rPr>
+              <w:t>2</w:t>
+            </w:r>
+          </w:p>
+        </w:tc>
+        <w:tc>
+          <w:tcPr>
+            <w:tcW w:type="dxa" w:w="3969"/>
+            <w:shd w:fill="F3F4F6" w:val="clear"/>
+          </w:tcPr>
+          <w:p>
+            <w:r>
+              <w:rPr>
+                <w:sz w:val="20"/>
+              </w:rPr>
+              <w:t>Project overview page</w:t>
+            </w:r>
+          </w:p>
+        </w:tc>
+      </w:tr>
+      <w:tr>
+        <w:tc>
+          <w:tcPr>
+            <w:tcW w:type="dxa" w:w="567"/>
+          </w:tcPr>
+          <w:p>
+            <w:r>
+              <w:rPr>
+                <w:sz w:val="20"/>
+              </w:rPr>
+              <w:t>13</w:t>
+            </w:r>
+          </w:p>
+        </w:tc>
+        <w:tc>
+          <w:tcPr>
+            <w:tcW w:type="dxa" w:w="1984"/>
+          </w:tcPr>
+          <w:p>
+            <w:r>
+              <w:rPr>
+                <w:sz w:val="20"/>
+              </w:rPr>
+              <w:t>Dark Mode</w:t>
+            </w:r>
+          </w:p>
+        </w:tc>
+        <w:tc>
+          <w:tcPr>
+            <w:tcW w:type="dxa" w:w="1984"/>
+          </w:tcPr>
+          <w:p>
+            <w:r>
+              <w:rPr>
+                <w:sz w:val="20"/>
+              </w:rPr>
+              <w:t>—</w:t>
+            </w:r>
+          </w:p>
+        </w:tc>
+        <w:tc>
+          <w:tcPr>
+            <w:tcW w:type="dxa" w:w="850"/>
+          </w:tcPr>
+          <w:p>
+            <w:r>
+              <w:rPr>
+                <w:sz w:val="20"/>
+              </w:rPr>
+              <w:t>2</w:t>
+            </w:r>
+          </w:p>
+        </w:tc>
+        <w:tc>
+          <w:tcPr>
             <w:tcW w:type="dxa" w:w="3969"/>
           </w:tcPr>
           <w:p>
@@ -1116,7 +1535,146 @@
               <w:rPr>
                 <w:sz w:val="20"/>
               </w:rPr>
-              <w:t>Project documentation</w:t>
+              <w:t>Auto dark/light theme switch</w:t>
+            </w:r>
+          </w:p>
+        </w:tc>
+      </w:tr>
+      <w:tr>
+        <w:tc>
+          <w:tcPr>
+            <w:tcW w:type="dxa" w:w="567"/>
+            <w:shd w:fill="F3F4F6" w:val="clear"/>
+          </w:tcPr>
+          <w:p>
+            <w:r>
+              <w:rPr>
+                <w:sz w:val="20"/>
+              </w:rPr>
+              <w:t>14</w:t>
+            </w:r>
+          </w:p>
+        </w:tc>
+        <w:tc>
+          <w:tcPr>
+            <w:tcW w:type="dxa" w:w="1984"/>
+            <w:shd w:fill="F3F4F6" w:val="clear"/>
+          </w:tcPr>
+          <w:p>
+            <w:r>
+              <w:rPr>
+                <w:sz w:val="20"/>
+              </w:rPr>
+              <w:t>Responsive Design</w:t>
+            </w:r>
+          </w:p>
+        </w:tc>
+        <w:tc>
+          <w:tcPr>
+            <w:tcW w:type="dxa" w:w="1984"/>
+            <w:shd w:fill="F3F4F6" w:val="clear"/>
+          </w:tcPr>
+          <w:p>
+            <w:r>
+              <w:rPr>
+                <w:sz w:val="20"/>
+              </w:rPr>
+              <w:t>—</w:t>
+            </w:r>
+          </w:p>
+        </w:tc>
+        <w:tc>
+          <w:tcPr>
+            <w:tcW w:type="dxa" w:w="850"/>
+            <w:shd w:fill="F3F4F6" w:val="clear"/>
+          </w:tcPr>
+          <w:p>
+            <w:r>
+              <w:rPr>
+                <w:sz w:val="20"/>
+              </w:rPr>
+              <w:t>2</w:t>
+            </w:r>
+          </w:p>
+        </w:tc>
+        <w:tc>
+          <w:tcPr>
+            <w:tcW w:type="dxa" w:w="3969"/>
+            <w:shd w:fill="F3F4F6" w:val="clear"/>
+          </w:tcPr>
+          <w:p>
+            <w:r>
+              <w:rPr>
+                <w:sz w:val="20"/>
+              </w:rPr>
+              <w:t>Mobile-friendly layout</w:t>
+            </w:r>
+          </w:p>
+        </w:tc>
+      </w:tr>
+      <w:tr>
+        <w:tc>
+          <w:tcPr>
+            <w:tcW w:type="dxa" w:w="567"/>
+          </w:tcPr>
+          <w:p>
+            <w:r>
+              <w:rPr>
+                <w:sz w:val="20"/>
+              </w:rPr>
+              <w:t>15</w:t>
+            </w:r>
+          </w:p>
+        </w:tc>
+        <w:tc>
+          <w:tcPr>
+            <w:tcW w:type="dxa" w:w="1984"/>
+          </w:tcPr>
+          <w:p>
+            <w:r>
+              <w:rPr>
+                <w:sz w:val="20"/>
+              </w:rPr>
+              <w:t>Error Handling</w:t>
+            </w:r>
+          </w:p>
+        </w:tc>
+        <w:tc>
+          <w:tcPr>
+            <w:tcW w:type="dxa" w:w="1984"/>
+          </w:tcPr>
+          <w:p>
+            <w:r>
+              <w:rPr>
+                <w:sz w:val="20"/>
+              </w:rPr>
+              <w:t>—</w:t>
+            </w:r>
+          </w:p>
+        </w:tc>
+        <w:tc>
+          <w:tcPr>
+            <w:tcW w:type="dxa" w:w="850"/>
+          </w:tcPr>
+          <w:p>
+            <w:r>
+              <w:rPr>
+                <w:sz w:val="20"/>
+              </w:rPr>
+              <w:t>2</w:t>
+            </w:r>
+          </w:p>
+        </w:tc>
+        <w:tc>
+          <w:tcPr>
+            <w:tcW w:type="dxa" w:w="3969"/>
+          </w:tcPr>
+          <w:p>
+            <w:r>
+              <w:rPr>
+                <w:sz w:val="20"/>
+              </w:rPr>
+              <w:t>404 page and Error Boundary</w:t>
             </w:r>
           </w:p>
         </w:tc>
@@ -1132,7 +1690,7 @@
     </w:p>
     <w:p>
       <w:r>
-        <w:t>The site has nine pages linked through a Navbar, covering personal background, skills, projects, blog, and messaging. It supports dark mode via prefers-color-scheme and uses CSS variables for theming.</w:t>
+        <w:t>The portfolio is developed in two phases. Phase 1 delivers the core structure: six static content pages (Home, About, Education, Knowledge, Gallery, Videos) plus the navigation bar, client-side routing, and CSS theming with CSS Modules and CSS Variables. Phase 2 adds interactive features — a Blog with Markdown rendering, an Instant Messaging page powered by a custom useChat hook, a README page, dark mode via prefers-color-scheme, responsive design, and error handling. This phased approach ensures a solid structural foundation before adding interactivity.</w:t>
       </w:r>
     </w:p>
     <w:p>
@@ -2748,7 +3306,7 @@
         <w:pStyle w:val="Heading2"/>
       </w:pPr>
       <w:r>
-        <w:t>8.3 Architecture Innovation</w:t>
+        <w:t>8.1 Architecture Innovation</w:t>
       </w:r>
     </w:p>
     <w:p>
@@ -2920,6 +3478,22 @@
         <w:t>11. References</w:t>
       </w:r>
       <w:bookmarkEnd w:id="11"/>
+    </w:p>
+    <w:p>
+      <w:r>
+        <w:rPr>
+          <w:sz w:val="20"/>
+        </w:rPr>
+        <w:t>[1] GeeksforGeeks (2025). Difference Between TypeScript and JavaScript. Available at: https://www.geeksforgeeks.org/typescript/difference-between-typescript-and-javascript/ (Accessed: September 2026).</w:t>
+      </w:r>
+    </w:p>
+    <w:p>
+      <w:r>
+        <w:rPr>
+          <w:sz w:val="20"/>
+        </w:rPr>
+        <w:t>[2] Mohanty, S. (2024). Difference Between Vite and Normal NPM. Available at: https://medium.com/@mailtosatyabratamohanty/difference-between-vite-and-normal-npm-2097c277beb0 (Accessed: September 2026).</w:t>
+      </w:r>
     </w:p>
     <w:sectPr>
       <w:pgSz w:w="12240" w:h="15840"/>

</xml_diff>

<commit_message>
docs: add component diagram, update report with enhancements, add PDF
</commit_message>
<xml_diff>
--- a/docs/Kewei_Portfolio_Technical_Report.docx
+++ b/docs/Kewei_Portfolio_Technical_Report.docx
@@ -473,11 +473,6 @@
       </w:tr>
     </w:tbl>
     <w:p>
-      <w:r>
-        <w:br w:type="page"/>
-      </w:r>
-    </w:p>
-    <w:p>
       <w:pPr>
         <w:pStyle w:val="Heading1"/>
       </w:pPr>
@@ -490,11 +485,6 @@
     <w:p>
       <w:r>
         <w:t>A portfolio website built with React, TypeScript, and Vite. It has nine pages, uses CSS Modules and CSS variables for styling, and includes a custom chat hook. Technologies are kept simple to stay lightweight. This report covers the discovery, design, implementation, and evaluation of the project.</w:t>
-      </w:r>
-    </w:p>
-    <w:p>
-      <w:r>
-        <w:br w:type="page"/>
       </w:r>
     </w:p>
     <w:p>
@@ -517,7 +507,7 @@
     </w:p>
     <w:p>
       <w:r>
-        <w:t>The portfolio website serves as a professional digital presence. It provides visitors with information about the author's background, skills, and work through an intuitive navigation system.</w:t>
+        <w:t>A React-based portfolio with nine pages covering background, skills, projects, blog, and messaging.</w:t>
       </w:r>
     </w:p>
     <w:p>
@@ -1690,12 +1680,7 @@
     </w:p>
     <w:p>
       <w:r>
-        <w:t>The portfolio is developed in two phases. Phase 1 delivers the core structure: six static content pages (Home, About, Education, Knowledge, Gallery, Videos) plus the navigation bar, client-side routing, and CSS theming with CSS Modules and CSS Variables. Phase 2 adds interactive features — a Blog with Markdown rendering, an Instant Messaging page powered by a custom useChat hook, a README page, dark mode via prefers-color-scheme, responsive design, and error handling. This phased approach ensures a solid structural foundation before adding interactivity.</w:t>
-      </w:r>
-    </w:p>
-    <w:p>
-      <w:r>
-        <w:br w:type="page"/>
+        <w:t>The portfolio is a single-page application built with React, TypeScript, and Vite. It has nine pages linked through a top navigation bar. Phase 1 covers six static content pages, routing, and CSS theming. Phase 2 adds interactive features — blog, messaging, and dark mode — plus responsive design and error handling.</w:t>
       </w:r>
     </w:p>
     <w:p>
@@ -2159,11 +2144,6 @@
         </w:tc>
       </w:tr>
     </w:tbl>
-    <w:p>
-      <w:r>
-        <w:br w:type="page"/>
-      </w:r>
-    </w:p>
     <w:p>
       <w:pPr>
         <w:pStyle w:val="Heading1"/>
@@ -2974,7 +2954,7 @@
               <w:rPr>
                 <w:sz w:val="20"/>
               </w:rPr>
-              <w:t>Data constants kept apart from rendering</w:t>
+              <w:t>Data constants separated from rendering</w:t>
             </w:r>
           </w:p>
         </w:tc>
@@ -3000,19 +2980,19 @@
         <w:pStyle w:val="Heading2"/>
       </w:pPr>
       <w:r>
-        <w:t>6.1 Architectural Overview</w:t>
+        <w:t>6.1 Architecture and Component Diagram</w:t>
       </w:r>
     </w:p>
     <w:p>
       <w:r>
-        <w:t>Entry (main.tsx → App.tsx) → Routing (BrowserRouter → Navbar + AppRouter) → Pages → Hooks (useChat) → Styles (CSS variables + CSS Modules).</w:t>
+        <w:t>main.tsx → App.tsx → BrowserRouter → Navbar + AppRouter → Pages → Hooks (useChat) → Styles (CSS Modules + Variables).</w:t>
       </w:r>
     </w:p>
     <w:p>
       <w:r>
         <w:drawing>
           <wp:inline xmlns:a="http://schemas.openxmlformats.org/drawingml/2006/main" xmlns:pic="http://schemas.openxmlformats.org/drawingml/2006/picture">
-            <wp:extent cx="5486400" cy="3916722"/>
+            <wp:extent cx="3200400" cy="2284754"/>
             <wp:docPr id="1" name="Picture 1"/>
             <wp:cNvGraphicFramePr>
               <a:graphicFrameLocks noChangeAspect="1"/>
@@ -3033,7 +3013,43 @@
                   <pic:spPr>
                     <a:xfrm>
                       <a:off x="0" y="0"/>
-                      <a:ext cx="5486400" cy="3916722"/>
+                      <a:ext cx="3200400" cy="2284754"/>
+                    </a:xfrm>
+                    <a:prstGeom prst="rect"/>
+                  </pic:spPr>
+                </pic:pic>
+              </a:graphicData>
+            </a:graphic>
+          </wp:inline>
+        </w:drawing>
+      </w:r>
+    </w:p>
+    <w:p>
+      <w:r>
+        <w:drawing>
+          <wp:inline xmlns:a="http://schemas.openxmlformats.org/drawingml/2006/main" xmlns:pic="http://schemas.openxmlformats.org/drawingml/2006/picture">
+            <wp:extent cx="3200400" cy="3174745"/>
+            <wp:docPr id="2" name="Picture 2"/>
+            <wp:cNvGraphicFramePr>
+              <a:graphicFrameLocks noChangeAspect="1"/>
+            </wp:cNvGraphicFramePr>
+            <a:graphic>
+              <a:graphicData uri="http://schemas.openxmlformats.org/drawingml/2006/picture">
+                <pic:pic>
+                  <pic:nvPicPr>
+                    <pic:cNvPr id="0" name="Component diagram.png"/>
+                    <pic:cNvPicPr/>
+                  </pic:nvPicPr>
+                  <pic:blipFill>
+                    <a:blip r:embed="rId10"/>
+                    <a:stretch>
+                      <a:fillRect/>
+                    </a:stretch>
+                  </pic:blipFill>
+                  <pic:spPr>
+                    <a:xfrm>
+                      <a:off x="0" y="0"/>
+                      <a:ext cx="3200400" cy="3174745"/>
                     </a:xfrm>
                     <a:prstGeom prst="rect"/>
                   </pic:spPr>
@@ -3049,28 +3065,15 @@
         <w:pStyle w:val="Heading2"/>
       </w:pPr>
       <w:r>
-        <w:t>6.2 Component Diagram</w:t>
-      </w:r>
-    </w:p>
-    <w:p>
-      <w:r>
-        <w:t>Since this project is currently only in the frontend stage and quite simple, you can refer to the component diagram in 6.1 Architectural Overview.</w:t>
-      </w:r>
-    </w:p>
-    <w:p>
-      <w:pPr>
-        <w:pStyle w:val="Heading2"/>
-      </w:pPr>
-      <w:r>
-        <w:t>6.3 Control Flow Diagram</w:t>
+        <w:t>6.2 Control Flow Diagram</w:t>
       </w:r>
     </w:p>
     <w:p>
       <w:r>
         <w:drawing>
           <wp:inline xmlns:a="http://schemas.openxmlformats.org/drawingml/2006/main" xmlns:pic="http://schemas.openxmlformats.org/drawingml/2006/picture">
-            <wp:extent cx="5486400" cy="4713947"/>
-            <wp:docPr id="2" name="Picture 2"/>
+            <wp:extent cx="3200400" cy="2749802"/>
+            <wp:docPr id="3" name="Picture 3"/>
             <wp:cNvGraphicFramePr>
               <a:graphicFrameLocks noChangeAspect="1"/>
             </wp:cNvGraphicFramePr>
@@ -3082,7 +3085,7 @@
                     <pic:cNvPicPr/>
                   </pic:nvPicPr>
                   <pic:blipFill>
-                    <a:blip r:embed="rId10"/>
+                    <a:blip r:embed="rId11"/>
                     <a:stretch>
                       <a:fillRect/>
                     </a:stretch>
@@ -3090,7 +3093,7 @@
                   <pic:spPr>
                     <a:xfrm>
                       <a:off x="0" y="0"/>
-                      <a:ext cx="5486400" cy="4713947"/>
+                      <a:ext cx="3200400" cy="2749802"/>
                     </a:xfrm>
                     <a:prstGeom prst="rect"/>
                   </pic:spPr>
@@ -3106,7 +3109,7 @@
         <w:pStyle w:val="Heading2"/>
       </w:pPr>
       <w:r>
-        <w:t>6.4 Design Decisions</w:t>
+        <w:t>6.3 Design Decisions</w:t>
       </w:r>
     </w:p>
     <w:p>
@@ -3197,7 +3200,7 @@
       <w:r>
         <w:rPr>
           <w:rFonts w:ascii="Consolas" w:hAnsi="Consolas"/>
-          <w:sz w:val="18"/>
+          <w:sz w:val="16"/>
         </w:rPr>
         <w:t>kewei-portfolio/</w:t>
         <w:br/>
@@ -3287,11 +3290,6 @@
       </w:r>
     </w:p>
     <w:p>
-      <w:r>
-        <w:br w:type="page"/>
-      </w:r>
-    </w:p>
-    <w:p>
       <w:pPr>
         <w:pStyle w:val="Heading1"/>
       </w:pPr>
@@ -3312,11 +3310,6 @@
     <w:p>
       <w:r>
         <w:t>Page-based layout with co-located CSS Modules — no global state, clear separation, Markdown blog without a CMS.</w:t>
-      </w:r>
-    </w:p>
-    <w:p>
-      <w:r>
-        <w:br w:type="page"/>
       </w:r>
     </w:p>
     <w:p>
@@ -3342,7 +3335,7 @@
         <w:pStyle w:val="ListBullet"/>
       </w:pPr>
       <w:r>
-        <w:t>Clean architecture: pages, components, hooks, and styles are separated.</w:t>
+        <w:t>Clean separation of pages, components, hooks, and styles.</w:t>
       </w:r>
     </w:p>
     <w:p>
@@ -3350,7 +3343,7 @@
         <w:pStyle w:val="ListBullet"/>
       </w:pPr>
       <w:r>
-        <w:t>Shared CSS variables with auto dark mode.</w:t>
+        <w:t>CSS variables with auto dark mode.</w:t>
       </w:r>
     </w:p>
     <w:p>
@@ -3358,7 +3351,7 @@
         <w:pStyle w:val="ListBullet"/>
       </w:pPr>
       <w:r>
-        <w:t>Custom Hook: useChat separates logic from UI.</w:t>
+        <w:t>useChat hook separates logic from UI.</w:t>
       </w:r>
     </w:p>
     <w:p>
@@ -3394,8 +3387,35 @@
       </w:r>
     </w:p>
     <w:p>
+      <w:pPr>
+        <w:pStyle w:val="Heading2"/>
+      </w:pPr>
       <w:r>
-        <w:br w:type="page"/>
+        <w:t>9.3 Enhancement Suggestions</w:t>
+      </w:r>
+    </w:p>
+    <w:p>
+      <w:pPr>
+        <w:pStyle w:val="ListBullet"/>
+      </w:pPr>
+      <w:r>
+        <w:t>Add tests for the useChat hook and key pages.</w:t>
+      </w:r>
+    </w:p>
+    <w:p>
+      <w:pPr>
+        <w:pStyle w:val="ListBullet"/>
+      </w:pPr>
+      <w:r>
+        <w:t>Add a 404 page and Error Boundary.</w:t>
+      </w:r>
+    </w:p>
+    <w:p>
+      <w:pPr>
+        <w:pStyle w:val="ListBullet"/>
+      </w:pPr>
+      <w:r>
+        <w:t>Add a hamburger menu for mobile.</w:t>
       </w:r>
     </w:p>
     <w:p>
@@ -3462,11 +3482,6 @@
       </w:pPr>
       <w:r>
         <w:t>Too many navbar links for mobile screens.</w:t>
-      </w:r>
-    </w:p>
-    <w:p>
-      <w:r>
-        <w:br w:type="page"/>
       </w:r>
     </w:p>
     <w:p>

</xml_diff>